<commit_message>
Add host server pre-requisites section to the Deployment Guide, and rebuild DOCX and PDF copies
</commit_message>
<xml_diff>
--- a/DEPLOYMENT_GUIDE.docx
+++ b/DEPLOYMENT_GUIDE.docx
@@ -876,7 +876,106 @@
         <w:jc w:val="both"/>
       </w:pPr>
       <w:r>
-        <w:t>Deploying the system locally involves setting up a private communication subnet to bridge your Windows PC server (localhost) and mobile devices. Below are two deployment methodologies.</w:t>
+        <w:t>Deploying the system locally involves setting up a private communication subnet to bridge your Windows PC server (localhost) and mobile devices.</w:t>
+      </w:r>
+    </w:p>
+    <w:p>
+      <w:pPr>
+        <w:pStyle w:val="Heading3"/>
+      </w:pPr>
+      <w:r>
+        <w:t>2.0. System Requirements &amp; Host Server Pre-Requisites</w:t>
+      </w:r>
+    </w:p>
+    <w:p>
+      <w:pPr>
+        <w:jc w:val="both"/>
+      </w:pPr>
+      <w:r>
+        <w:t>Before attempting to deploy, run, or build the ARDMS server and applications, ensure that the following core software resources are installed and configured on the host server computer:</w:t>
+      </w:r>
+    </w:p>
+    <w:p>
+      <w:pPr>
+        <w:pStyle w:val="ListBullet"/>
+      </w:pPr>
+      <w:r/>
+      <w:r>
+        <w:rPr>
+          <w:b/>
+        </w:rPr>
+        <w:t>Node.js (v18+):</w:t>
+      </w:r>
+      <w:r>
+        <w:t xml:space="preserve"> Required to run the Express backend server and manage library packages (`npm`).</w:t>
+      </w:r>
+    </w:p>
+    <w:p>
+      <w:pPr>
+        <w:pStyle w:val="ListBullet"/>
+      </w:pPr>
+      <w:r/>
+      <w:r>
+        <w:rPr>
+          <w:b/>
+        </w:rPr>
+        <w:t>Python (v3+):</w:t>
+      </w:r>
+      <w:r>
+        <w:t xml:space="preserve"> Needed to run the internal automation, synchronization, and build-triggering scripts (`sync_apps.py`, etc.).</w:t>
+      </w:r>
+    </w:p>
+    <w:p>
+      <w:pPr>
+        <w:pStyle w:val="ListBullet"/>
+      </w:pPr>
+      <w:r/>
+      <w:r>
+        <w:rPr>
+          <w:b/>
+        </w:rPr>
+        <w:t>Java Development Kit (JDK 17):</w:t>
+      </w:r>
+      <w:r>
+        <w:t xml:space="preserve"> Crucial requirement for compilation of the Android APK wrappers using React Native Gradle tasks.</w:t>
+      </w:r>
+    </w:p>
+    <w:p>
+      <w:pPr>
+        <w:pStyle w:val="ListBullet"/>
+      </w:pPr>
+      <w:r/>
+      <w:r>
+        <w:rPr>
+          <w:b/>
+        </w:rPr>
+        <w:t>Git:</w:t>
+      </w:r>
+      <w:r>
+        <w:t xml:space="preserve"> Version control engine to manage the repository and download code updates.</w:t>
+      </w:r>
+    </w:p>
+    <w:p>
+      <w:pPr>
+        <w:pStyle w:val="ListBullet"/>
+      </w:pPr>
+      <w:r/>
+      <w:r>
+        <w:rPr>
+          <w:b/>
+        </w:rPr>
+        <w:t>Android SDK / Android Studio Command Line Tools:</w:t>
+      </w:r>
+      <w:r>
+        <w:t xml:space="preserve"> Required for packaging the APK files. Ensure `ANDROID_HOME` is set in your environment path variables (e.g., `C:\Users\Alienware\AppData\Local\Android\Sdk`).</w:t>
+      </w:r>
+    </w:p>
+    <w:p>
+      <w:pPr>
+        <w:jc w:val="both"/>
+      </w:pPr>
+      <w:r>
+        <w:t>Below are the two deployment methodologies.</w:t>
       </w:r>
     </w:p>
     <w:p>

</xml_diff>

<commit_message>
Working System V2 05-07-2026
</commit_message>
<xml_diff>
--- a/DEPLOYMENT_GUIDE.docx
+++ b/DEPLOYMENT_GUIDE.docx
@@ -893,6 +893,46 @@
       </w:pPr>
       <w:r>
         <w:t>Before attempting to deploy, run, or build the ARDMS server and applications, ensure that the following core software resources are installed and configured on the host server computer:</w:t>
+      </w:r>
+    </w:p>
+    <w:p>
+      <w:pPr>
+        <w:jc w:val="both"/>
+      </w:pPr>
+      <w:r>
+        <w:t xml:space="preserve">&gt; </w:t>
+      </w:r>
+      <w:r>
+        <w:rPr>
+          <w:b/>
+        </w:rPr>
+        <w:t>IMPORTANT NOTE:</w:t>
+      </w:r>
+      <w:r/>
+    </w:p>
+    <w:p>
+      <w:pPr>
+        <w:jc w:val="both"/>
+      </w:pPr>
+      <w:r>
+        <w:t xml:space="preserve">&gt; * You </w:t>
+      </w:r>
+      <w:r>
+        <w:rPr>
+          <w:b/>
+        </w:rPr>
+        <w:t>MUST</w:t>
+      </w:r>
+      <w:r>
+        <w:t xml:space="preserve"> install Node.js (v18 or higher) to run the backend API server. Without Node.js, the `npm start` command will fail and the apps won't connect.</w:t>
+      </w:r>
+    </w:p>
+    <w:p>
+      <w:pPr>
+        <w:jc w:val="both"/>
+      </w:pPr>
+      <w:r>
+        <w:t>&gt; * You also need Python (v3+) to run the build scripts, and Java Development Kit (JDK 17) to compile the Android apps.</w:t>
       </w:r>
     </w:p>
     <w:p>

</xml_diff>